<commit_message>
actividades  computación en la nube Servicios (IaaS, PaaS, Saas y docker (25/09)
</commit_message>
<xml_diff>
--- a/1ERA EV/OP-CN (COMPUTACIÓN NUBE)/UD1.1 Identificando componentes y modelos de servicio.docx
+++ b/1ERA EV/OP-CN (COMPUTACIÓN NUBE)/UD1.1 Identificando componentes y modelos de servicio.docx
@@ -5,6 +5,7 @@
     <w:sdt>
       <w:sdtPr>
         <w:rPr>
+          <w:rFonts w:ascii="Calibri" w:eastAsia="Calibri" w:hAnsi="Calibri" w:cs="Calibri"/>
           <w:color w:val="5B9BD5" w:themeColor="accent1"/>
         </w:rPr>
         <w:id w:val="483593342"/>
@@ -15,7 +16,6 @@
       </w:sdtPr>
       <w:sdtEndPr>
         <w:rPr>
-          <w:rFonts w:ascii="Calibri" w:eastAsia="Calibri" w:hAnsi="Calibri" w:cs="Calibri"/>
           <w:color w:val="2F5496"/>
           <w:sz w:val="32"/>
         </w:rPr>
@@ -36,7 +36,7 @@
               <w:color w:val="5B9BD5" w:themeColor="accent1"/>
             </w:rPr>
             <w:drawing>
-              <wp:inline distT="0" distB="0" distL="0" distR="0">
+              <wp:inline distT="0" distB="0" distL="0" distR="0" wp14:anchorId="1007B51C" wp14:editId="12BBA66D">
                 <wp:extent cx="1417320" cy="750898"/>
                 <wp:effectExtent l="0" t="0" r="0" b="0"/>
                 <wp:docPr id="143" name="Imagen 143"/>
@@ -171,7 +171,7 @@
             <mc:AlternateContent>
               <mc:Choice Requires="wps">
                 <w:drawing>
-                  <wp:anchor distT="0" distB="0" distL="114300" distR="114300" simplePos="0" relativeHeight="251661312" behindDoc="0" locked="0" layoutInCell="1" allowOverlap="1">
+                  <wp:anchor distT="0" distB="0" distL="114300" distR="114300" simplePos="0" relativeHeight="251661312" behindDoc="0" locked="0" layoutInCell="1" allowOverlap="1" wp14:anchorId="43EC605D" wp14:editId="5E39B589">
                     <wp:simplePos x="0" y="0"/>
                     <wp:positionH relativeFrom="margin">
                       <wp:align>center</wp:align>
@@ -239,13 +239,14 @@
                                   <w:tag w:val=""/>
                                   <w:id w:val="197127006"/>
                                   <w:dataBinding w:prefixMappings="xmlns:ns0='http://schemas.microsoft.com/office/2006/coverPageProps' " w:xpath="/ns0:CoverPageProperties[1]/ns0:PublishDate[1]" w:storeItemID="{55AF091B-3C7A-41E3-B477-F2FDAA23CFDA}"/>
-                                  <w:date w:fullDate="2026-09-18T00:00:00Z">
+                                  <w:date w:fullDate="2026-09-25T00:00:00Z">
                                     <w:dateFormat w:val="d 'de' MMMM 'de' yyyy"/>
                                     <w:lid w:val="es-ES"/>
                                     <w:storeMappedDataAs w:val="dateTime"/>
                                     <w:calendar w:val="gregorian"/>
                                   </w:date>
                                 </w:sdtPr>
+                                <w:sdtEndPr/>
                                 <w:sdtContent>
                                   <w:p>
                                     <w:pPr>
@@ -266,7 +267,7 @@
                                         <w:sz w:val="28"/>
                                         <w:szCs w:val="28"/>
                                       </w:rPr>
-                                      <w:t>18 de septiembre de 2026</w:t>
+                                      <w:t>25 de septiembre de 2026</w:t>
                                     </w:r>
                                   </w:p>
                                 </w:sdtContent>
@@ -282,10 +283,17 @@
                               <w:p>
                                 <w:pPr>
                                   <w:pStyle w:val="Sinespaciado"/>
+                                  <w:ind w:left="2832" w:firstLine="708"/>
                                   <w:rPr>
                                     <w:color w:val="5B9BD5" w:themeColor="accent1"/>
                                   </w:rPr>
                                 </w:pPr>
+                                <w:r>
+                                  <w:rPr>
+                                    <w:color w:val="5B9BD5" w:themeColor="accent1"/>
+                                  </w:rPr>
+                                  <w:t>Joaquín Valentín Ottonello</w:t>
+                                </w:r>
                               </w:p>
                             </w:txbxContent>
                           </wps:txbx>
@@ -309,7 +317,7 @@
               </mc:Choice>
               <mc:Fallback>
                 <w:pict>
-                  <v:shapetype id="_x0000_t202" coordsize="21600,21600" o:spt="202" path="m,l,21600r21600,l21600,xe">
+                  <v:shapetype w14:anchorId="43EC605D" id="_x0000_t202" coordsize="21600,21600" o:spt="202" path="m,l,21600r21600,l21600,xe">
                     <v:stroke joinstyle="miter"/>
                     <v:path gradientshapeok="t" o:connecttype="rect"/>
                   </v:shapetype>
@@ -328,13 +336,14 @@
                             <w:tag w:val=""/>
                             <w:id w:val="197127006"/>
                             <w:dataBinding w:prefixMappings="xmlns:ns0='http://schemas.microsoft.com/office/2006/coverPageProps' " w:xpath="/ns0:CoverPageProperties[1]/ns0:PublishDate[1]" w:storeItemID="{55AF091B-3C7A-41E3-B477-F2FDAA23CFDA}"/>
-                            <w:date w:fullDate="2026-09-18T00:00:00Z">
+                            <w:date w:fullDate="2026-09-25T00:00:00Z">
                               <w:dateFormat w:val="d 'de' MMMM 'de' yyyy"/>
                               <w:lid w:val="es-ES"/>
                               <w:storeMappedDataAs w:val="dateTime"/>
                               <w:calendar w:val="gregorian"/>
                             </w:date>
                           </w:sdtPr>
+                          <w:sdtEndPr/>
                           <w:sdtContent>
                             <w:p>
                               <w:pPr>
@@ -355,7 +364,7 @@
                                   <w:sz w:val="28"/>
                                   <w:szCs w:val="28"/>
                                 </w:rPr>
-                                <w:t>18 de septiembre de 2026</w:t>
+                                <w:t>25 de septiembre de 2026</w:t>
                               </w:r>
                             </w:p>
                           </w:sdtContent>
@@ -371,10 +380,17 @@
                         <w:p>
                           <w:pPr>
                             <w:pStyle w:val="Sinespaciado"/>
+                            <w:ind w:left="2832" w:firstLine="708"/>
                             <w:rPr>
                               <w:color w:val="5B9BD5" w:themeColor="accent1"/>
                             </w:rPr>
                           </w:pPr>
+                          <w:r>
+                            <w:rPr>
+                              <w:color w:val="5B9BD5" w:themeColor="accent1"/>
+                            </w:rPr>
+                            <w:t>Joaquín Valentín Ottonello</w:t>
+                          </w:r>
                         </w:p>
                       </w:txbxContent>
                     </v:textbox>
@@ -390,7 +406,7 @@
               <w:color w:val="5B9BD5" w:themeColor="accent1"/>
             </w:rPr>
             <w:drawing>
-              <wp:inline distT="0" distB="0" distL="0" distR="0">
+              <wp:inline distT="0" distB="0" distL="0" distR="0" wp14:anchorId="66F63C3B" wp14:editId="0F71A01E">
                 <wp:extent cx="758952" cy="478932"/>
                 <wp:effectExtent l="0" t="0" r="3175" b="0"/>
                 <wp:docPr id="144" name="Imagen 144"/>
@@ -441,34 +457,459 @@
         </w:p>
         <w:p>
           <w:pPr>
+            <w:pStyle w:val="Ttulo1"/>
+            <w:ind w:firstLine="695"/>
+            <w:rPr>
+              <w:color w:val="2F5496"/>
+            </w:rPr>
+          </w:pPr>
+          <w:r>
+            <w:rPr>
+              <w:color w:val="2F5496"/>
+            </w:rPr>
+            <w:br w:type="page"/>
+          </w:r>
+          <w:bookmarkStart w:id="0" w:name="_GoBack"/>
+          <w:bookmarkEnd w:id="0"/>
+        </w:p>
+        <w:p>
+          <w:pPr>
+            <w:pStyle w:val="Ttulo1"/>
+            <w:ind w:left="708" w:firstLine="72"/>
+            <w:rPr>
+              <w:noProof/>
+            </w:rPr>
+          </w:pPr>
+          <w:bookmarkStart w:id="1" w:name="_Toc241249779"/>
+          <w:r>
+            <w:rPr>
+              <w:rStyle w:val="Textoennegrita"/>
+            </w:rPr>
+            <w:lastRenderedPageBreak/>
+            <w:t>INDICE</w:t>
+          </w:r>
+          <w:bookmarkEnd w:id="1"/>
+          <w:r>
+            <w:rPr>
+              <w:rStyle w:val="Textoennegrita"/>
+            </w:rPr>
+            <w:br/>
+          </w:r>
+          <w:r>
+            <w:rPr>
+              <w:rStyle w:val="Textoennegrita"/>
+            </w:rPr>
+            <w:fldChar w:fldCharType="begin"/>
+          </w:r>
+          <w:r>
+            <w:rPr>
+              <w:rStyle w:val="Textoennegrita"/>
+            </w:rPr>
+            <w:instrText xml:space="preserve"> TOC \o "1-1" \u </w:instrText>
+          </w:r>
+          <w:r>
+            <w:rPr>
+              <w:rStyle w:val="Textoennegrita"/>
+            </w:rPr>
+            <w:fldChar w:fldCharType="separate"/>
+          </w:r>
+        </w:p>
+        <w:p>
+          <w:pPr>
+            <w:pStyle w:val="TDC1"/>
+            <w:tabs>
+              <w:tab w:val="right" w:leader="dot" w:pos="8499"/>
+            </w:tabs>
+            <w:ind w:left="800"/>
+            <w:rPr>
+              <w:rFonts w:asciiTheme="minorHAnsi" w:eastAsiaTheme="minorEastAsia" w:hAnsiTheme="minorHAnsi" w:cstheme="minorBidi"/>
+              <w:noProof/>
+              <w:color w:val="auto"/>
+            </w:rPr>
+          </w:pPr>
+          <w:r>
+            <w:rPr>
+              <w:b/>
+              <w:bCs/>
+              <w:noProof/>
+            </w:rPr>
+            <w:t>INDICE</w:t>
+          </w:r>
+          <w:r>
+            <w:rPr>
+              <w:noProof/>
+            </w:rPr>
+            <w:tab/>
+          </w:r>
+          <w:r>
+            <w:rPr>
+              <w:noProof/>
+            </w:rPr>
+            <w:fldChar w:fldCharType="begin"/>
+          </w:r>
+          <w:r>
+            <w:rPr>
+              <w:noProof/>
+            </w:rPr>
+            <w:instrText xml:space="preserve"> PAGEREF _Toc241249779 \h </w:instrText>
+          </w:r>
+          <w:r>
+            <w:rPr>
+              <w:noProof/>
+            </w:rPr>
+          </w:r>
+          <w:r>
+            <w:rPr>
+              <w:noProof/>
+            </w:rPr>
+            <w:fldChar w:fldCharType="separate"/>
+          </w:r>
+          <w:r>
+            <w:rPr>
+              <w:noProof/>
+            </w:rPr>
+            <w:t>1</w:t>
+          </w:r>
+          <w:r>
+            <w:rPr>
+              <w:noProof/>
+            </w:rPr>
+            <w:fldChar w:fldCharType="end"/>
+          </w:r>
+        </w:p>
+        <w:p>
+          <w:pPr>
+            <w:pStyle w:val="TDC1"/>
+            <w:tabs>
+              <w:tab w:val="right" w:leader="dot" w:pos="8499"/>
+            </w:tabs>
+            <w:ind w:left="800"/>
+            <w:rPr>
+              <w:rFonts w:asciiTheme="minorHAnsi" w:eastAsiaTheme="minorEastAsia" w:hAnsiTheme="minorHAnsi" w:cstheme="minorBidi"/>
+              <w:noProof/>
+              <w:color w:val="auto"/>
+            </w:rPr>
+          </w:pPr>
+          <w:r>
+            <w:rPr>
+              <w:noProof/>
+              <w:color w:val="2F5496"/>
+            </w:rPr>
+            <w:t>UD1 - Práctica 1. Identificando componentes y modelos de servicio</w:t>
+          </w:r>
+          <w:r>
+            <w:rPr>
+              <w:noProof/>
+            </w:rPr>
+            <w:tab/>
+          </w:r>
+          <w:r>
+            <w:rPr>
+              <w:noProof/>
+            </w:rPr>
+            <w:fldChar w:fldCharType="begin"/>
+          </w:r>
+          <w:r>
+            <w:rPr>
+              <w:noProof/>
+            </w:rPr>
+            <w:instrText xml:space="preserve"> PAGEREF _Toc241249780 \h </w:instrText>
+          </w:r>
+          <w:r>
+            <w:rPr>
+              <w:noProof/>
+            </w:rPr>
+          </w:r>
+          <w:r>
+            <w:rPr>
+              <w:noProof/>
+            </w:rPr>
+            <w:fldChar w:fldCharType="separate"/>
+          </w:r>
+          <w:r>
+            <w:rPr>
+              <w:noProof/>
+            </w:rPr>
+            <w:t>1</w:t>
+          </w:r>
+          <w:r>
+            <w:rPr>
+              <w:noProof/>
+            </w:rPr>
+            <w:fldChar w:fldCharType="end"/>
+          </w:r>
+        </w:p>
+        <w:p>
+          <w:pPr>
+            <w:pStyle w:val="TDC1"/>
+            <w:tabs>
+              <w:tab w:val="right" w:leader="dot" w:pos="8499"/>
+            </w:tabs>
+            <w:ind w:left="800"/>
+            <w:rPr>
+              <w:rFonts w:asciiTheme="minorHAnsi" w:eastAsiaTheme="minorEastAsia" w:hAnsiTheme="minorHAnsi" w:cstheme="minorBidi"/>
+              <w:noProof/>
+              <w:color w:val="auto"/>
+            </w:rPr>
+          </w:pPr>
+          <w:r>
+            <w:rPr>
+              <w:b/>
+              <w:bCs/>
+              <w:noProof/>
+            </w:rPr>
+            <w:t>DESARROLLO</w:t>
+          </w:r>
+          <w:r>
+            <w:rPr>
+              <w:noProof/>
+            </w:rPr>
+            <w:tab/>
+          </w:r>
+          <w:r>
+            <w:rPr>
+              <w:noProof/>
+            </w:rPr>
+            <w:fldChar w:fldCharType="begin"/>
+          </w:r>
+          <w:r>
+            <w:rPr>
+              <w:noProof/>
+            </w:rPr>
+            <w:instrText xml:space="preserve"> PAGEREF _Toc241249781 \h </w:instrText>
+          </w:r>
+          <w:r>
+            <w:rPr>
+              <w:noProof/>
+            </w:rPr>
+          </w:r>
+          <w:r>
+            <w:rPr>
+              <w:noProof/>
+            </w:rPr>
+            <w:fldChar w:fldCharType="separate"/>
+          </w:r>
+          <w:r>
+            <w:rPr>
+              <w:noProof/>
+            </w:rPr>
+            <w:t>2</w:t>
+          </w:r>
+          <w:r>
+            <w:rPr>
+              <w:noProof/>
+            </w:rPr>
+            <w:fldChar w:fldCharType="end"/>
+          </w:r>
+        </w:p>
+        <w:p>
+          <w:pPr>
+            <w:pStyle w:val="TDC1"/>
+            <w:tabs>
+              <w:tab w:val="right" w:leader="dot" w:pos="8499"/>
+            </w:tabs>
+            <w:ind w:left="800"/>
+            <w:rPr>
+              <w:rFonts w:asciiTheme="minorHAnsi" w:eastAsiaTheme="minorEastAsia" w:hAnsiTheme="minorHAnsi" w:cstheme="minorBidi"/>
+              <w:noProof/>
+              <w:color w:val="auto"/>
+            </w:rPr>
+          </w:pPr>
+          <w:r>
+            <w:rPr>
+              <w:b/>
+              <w:bCs/>
+              <w:noProof/>
+            </w:rPr>
+            <w:t>Servicios</w:t>
+          </w:r>
+          <w:r>
+            <w:rPr>
+              <w:noProof/>
+            </w:rPr>
+            <w:tab/>
+          </w:r>
+          <w:r>
+            <w:rPr>
+              <w:noProof/>
+            </w:rPr>
+            <w:fldChar w:fldCharType="begin"/>
+          </w:r>
+          <w:r>
+            <w:rPr>
+              <w:noProof/>
+            </w:rPr>
+            <w:instrText xml:space="preserve"> PAGEREF _Toc241249782 \h </w:instrText>
+          </w:r>
+          <w:r>
+            <w:rPr>
+              <w:noProof/>
+            </w:rPr>
+          </w:r>
+          <w:r>
+            <w:rPr>
+              <w:noProof/>
+            </w:rPr>
+            <w:fldChar w:fldCharType="separate"/>
+          </w:r>
+          <w:r>
+            <w:rPr>
+              <w:noProof/>
+            </w:rPr>
+            <w:t>2</w:t>
+          </w:r>
+          <w:r>
+            <w:rPr>
+              <w:noProof/>
+            </w:rPr>
+            <w:fldChar w:fldCharType="end"/>
+          </w:r>
+        </w:p>
+        <w:p>
+          <w:pPr>
+            <w:pStyle w:val="TDC1"/>
+            <w:tabs>
+              <w:tab w:val="right" w:leader="dot" w:pos="8499"/>
+            </w:tabs>
+            <w:ind w:left="800"/>
+            <w:rPr>
+              <w:rFonts w:asciiTheme="minorHAnsi" w:eastAsiaTheme="minorEastAsia" w:hAnsiTheme="minorHAnsi" w:cstheme="minorBidi"/>
+              <w:noProof/>
+              <w:color w:val="auto"/>
+            </w:rPr>
+          </w:pPr>
+          <w:r>
+            <w:rPr>
+              <w:b/>
+              <w:bCs/>
+              <w:noProof/>
+            </w:rPr>
+            <w:t>Nubes</w:t>
+          </w:r>
+          <w:r>
+            <w:rPr>
+              <w:noProof/>
+            </w:rPr>
+            <w:tab/>
+          </w:r>
+          <w:r>
+            <w:rPr>
+              <w:noProof/>
+            </w:rPr>
+            <w:fldChar w:fldCharType="begin"/>
+          </w:r>
+          <w:r>
+            <w:rPr>
+              <w:noProof/>
+            </w:rPr>
+            <w:instrText xml:space="preserve"> PAGEREF _Toc241249783 \h </w:instrText>
+          </w:r>
+          <w:r>
+            <w:rPr>
+              <w:noProof/>
+            </w:rPr>
+          </w:r>
+          <w:r>
+            <w:rPr>
+              <w:noProof/>
+            </w:rPr>
+            <w:fldChar w:fldCharType="separate"/>
+          </w:r>
+          <w:r>
+            <w:rPr>
+              <w:noProof/>
+            </w:rPr>
+            <w:t>3</w:t>
+          </w:r>
+          <w:r>
+            <w:rPr>
+              <w:noProof/>
+            </w:rPr>
+            <w:fldChar w:fldCharType="end"/>
+          </w:r>
+        </w:p>
+        <w:p>
+          <w:pPr>
+            <w:pStyle w:val="TDC1"/>
+            <w:tabs>
+              <w:tab w:val="right" w:leader="dot" w:pos="8499"/>
+            </w:tabs>
+            <w:ind w:left="800"/>
+            <w:rPr>
+              <w:rStyle w:val="Textoennegrita"/>
+              <w:rFonts w:asciiTheme="minorHAnsi" w:eastAsiaTheme="minorEastAsia" w:hAnsiTheme="minorHAnsi" w:cstheme="minorBidi"/>
+              <w:b w:val="0"/>
+              <w:bCs w:val="0"/>
+              <w:noProof/>
+              <w:color w:val="auto"/>
+            </w:rPr>
+          </w:pPr>
+          <w:r>
+            <w:rPr>
+              <w:b/>
+              <w:bCs/>
+              <w:noProof/>
+            </w:rPr>
+            <w:t>Idea de negocio</w:t>
+          </w:r>
+          <w:r>
+            <w:rPr>
+              <w:noProof/>
+            </w:rPr>
+            <w:tab/>
+          </w:r>
+          <w:r>
+            <w:rPr>
+              <w:noProof/>
+            </w:rPr>
+            <w:fldChar w:fldCharType="begin"/>
+          </w:r>
+          <w:r>
+            <w:rPr>
+              <w:noProof/>
+            </w:rPr>
+            <w:instrText xml:space="preserve"> PAGEREF _Toc241249784 \h </w:instrText>
+          </w:r>
+          <w:r>
+            <w:rPr>
+              <w:noProof/>
+            </w:rPr>
+          </w:r>
+          <w:r>
+            <w:rPr>
+              <w:noProof/>
+            </w:rPr>
+            <w:fldChar w:fldCharType="separate"/>
+          </w:r>
+          <w:r>
+            <w:rPr>
+              <w:noProof/>
+            </w:rPr>
+            <w:t>3</w:t>
+          </w:r>
+          <w:r>
+            <w:rPr>
+              <w:noProof/>
+            </w:rPr>
+            <w:fldChar w:fldCharType="end"/>
+          </w:r>
+          <w:r>
+            <w:rPr>
+              <w:rStyle w:val="Textoennegrita"/>
+            </w:rPr>
+            <w:fldChar w:fldCharType="end"/>
+          </w:r>
+        </w:p>
+        <w:p/>
+        <w:p/>
+        <w:p/>
+        <w:p>
+          <w:pPr>
             <w:spacing w:after="160" w:line="259" w:lineRule="auto"/>
             <w:ind w:left="0" w:firstLine="0"/>
             <w:jc w:val="left"/>
-            <w:rPr>
-              <w:color w:val="2F5496"/>
-              <w:sz w:val="32"/>
-            </w:rPr>
           </w:pPr>
           <w:r>
-            <w:rPr>
-              <w:color w:val="2F5496"/>
-              <w:sz w:val="32"/>
-            </w:rPr>
-            <w:br w:type="page"/>
-          </w:r>
-          <w:r>
-            <w:rPr>
-              <w:color w:val="2F5496"/>
-              <w:sz w:val="32"/>
-            </w:rPr>
-            <w:lastRenderedPageBreak/>
-            <w:t xml:space="preserve"> </w:t>
-          </w:r>
-          <w:r>
-            <w:rPr>
-              <w:color w:val="2F5496"/>
-              <w:sz w:val="32"/>
-            </w:rPr>
             <w:br w:type="page"/>
           </w:r>
         </w:p>
@@ -476,17 +917,27 @@
     </w:sdt>
     <w:p>
       <w:pPr>
-        <w:spacing w:after="38" w:line="222" w:lineRule="auto"/>
-        <w:ind w:left="0" w:firstLine="0"/>
-        <w:jc w:val="left"/>
-      </w:pPr>
+        <w:pStyle w:val="Ttulo1"/>
+        <w:ind w:firstLine="695"/>
+        <w:rPr>
+          <w:b/>
+          <w:bCs/>
+        </w:rPr>
+      </w:pPr>
+      <w:bookmarkStart w:id="2" w:name="_Toc241249780"/>
       <w:r>
         <w:rPr>
           <w:color w:val="2F5496"/>
-          <w:sz w:val="32"/>
         </w:rPr>
         <w:lastRenderedPageBreak/>
-        <w:t xml:space="preserve">UD1 - Práctica 1. Identificando componentes y modelos de servicio </w:t>
+        <w:t>UD1 - Práctica 1. Identificando componentes y modelos de servicio</w:t>
+      </w:r>
+      <w:bookmarkEnd w:id="2"/>
+      <w:r>
+        <w:rPr>
+          <w:color w:val="2F5496"/>
+        </w:rPr>
+        <w:t xml:space="preserve"> </w:t>
       </w:r>
     </w:p>
     <w:p>
@@ -526,10 +977,7 @@
         <w:ind w:hanging="360"/>
       </w:pPr>
       <w:r>
-        <w:t xml:space="preserve">Explicad con vuestras </w:t>
-      </w:r>
-      <w:r>
-        <w:t xml:space="preserve">palabras la diferencia entre </w:t>
+        <w:t xml:space="preserve">Explicad con vuestras palabras la diferencia entre </w:t>
       </w:r>
       <w:proofErr w:type="spellStart"/>
       <w:r>
@@ -557,10 +1005,7 @@
         <w:ind w:hanging="360"/>
       </w:pPr>
       <w:r>
-        <w:t>Explicad con vuestras palabras las principales diferencias entre nube pública, privada e híbrida. Investi</w:t>
-      </w:r>
-      <w:r>
-        <w:t xml:space="preserve">gad el modelo de despliegue concreto que utiliza una empresa de vuestra elección, el proveedor del servicio y justificad dicha decisión en base a criterios objetivos. </w:t>
+        <w:t xml:space="preserve">Explicad con vuestras palabras las principales diferencias entre nube pública, privada e híbrida. Investigad el modelo de despliegue concreto que utiliza una empresa de vuestra elección, el proveedor del servicio y justificad dicha decisión en base a criterios objetivos. </w:t>
       </w:r>
     </w:p>
     <w:p>
@@ -573,13 +1018,7 @@
         <w:ind w:hanging="360"/>
       </w:pPr>
       <w:r>
-        <w:t xml:space="preserve">Proponed brevemente (no más de 5 o 6 líneas) un negocio relacionado con desarrollo web. </w:t>
-      </w:r>
-      <w:r>
-        <w:t>Investigad que soluciones comerciales en la nube podéis utilizar, considerando al menos dos niveles de servicio. Escoged una solución comercial para cada nivel e investigad los servicios que ofrece, así como el coste. Justificad vuestras decisiones en base</w:t>
-      </w:r>
-      <w:r>
-        <w:t xml:space="preserve"> a no menos de dos ventajas para cada servicio, así como dos inconvenientes. Cread un diagrama en el que expliquéis la interacción entre los diferentes niveles de servicio. </w:t>
+        <w:t xml:space="preserve">Proponed brevemente (no más de 5 o 6 líneas) un negocio relacionado con desarrollo web. Investigad que soluciones comerciales en la nube podéis utilizar, considerando al menos dos niveles de servicio. Escoged una solución comercial para cada nivel e investigad los servicios que ofrece, así como el coste. Justificad vuestras decisiones en base a no menos de dos ventajas para cada servicio, así como dos inconvenientes. Cread un diagrama en el que expliquéis la interacción entre los diferentes niveles de servicio. </w:t>
       </w:r>
     </w:p>
     <w:p>
@@ -605,7 +1044,7 @@
         <mc:AlternateContent>
           <mc:Choice Requires="wpg">
             <w:drawing>
-              <wp:anchor distT="0" distB="0" distL="114300" distR="114300" simplePos="0" relativeHeight="251658240" behindDoc="0" locked="0" layoutInCell="1" allowOverlap="1">
+              <wp:anchor distT="0" distB="0" distL="114300" distR="114300" simplePos="0" relativeHeight="251658240" behindDoc="0" locked="0" layoutInCell="1" allowOverlap="1" wp14:anchorId="78A4F1D8" wp14:editId="6ADED6FD">
                 <wp:simplePos x="0" y="0"/>
                 <wp:positionH relativeFrom="page">
                   <wp:posOffset>0</wp:posOffset>
@@ -1163,7 +1602,7 @@
           </mc:Choice>
           <mc:Fallback>
             <w:pict>
-              <v:group id="Group 1074" o:spid="_x0000_s1027" style="position:absolute;margin-left:0;margin-top:0;width:595.3pt;height:87.75pt;z-index:251658240;mso-position-horizontal-relative:page;mso-position-vertical-relative:page" coordsize="75605,11144" o:gfxdata="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">
+              <v:group w14:anchorId="78A4F1D8" id="Group 1074" o:spid="_x0000_s1027" style="position:absolute;margin-left:0;margin-top:0;width:595.3pt;height:87.75pt;z-index:251658240;mso-position-horizontal-relative:page;mso-position-vertical-relative:page" coordsize="75605,11144" o:gfxdata="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">
                 <v:rect id="Rectangle 6" o:spid="_x0000_s1028" style="position:absolute;left:10808;top:4770;width:421;height:1899;visibility:visible;mso-wrap-style:square;v-text-anchor:top" o:gfxdata="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" filled="f" stroked="f">
                   <v:textbox inset="0,0,0,0">
                     <w:txbxContent>
@@ -1362,7 +1801,7 @@
         <mc:AlternateContent>
           <mc:Choice Requires="wpg">
             <w:drawing>
-              <wp:anchor distT="0" distB="0" distL="114300" distR="114300" simplePos="0" relativeHeight="251659264" behindDoc="0" locked="0" layoutInCell="1" allowOverlap="1">
+              <wp:anchor distT="0" distB="0" distL="114300" distR="114300" simplePos="0" relativeHeight="251659264" behindDoc="0" locked="0" layoutInCell="1" allowOverlap="1" wp14:anchorId="01EA9AEE" wp14:editId="2046490C">
                 <wp:simplePos x="0" y="0"/>
                 <wp:positionH relativeFrom="page">
                   <wp:posOffset>7020560</wp:posOffset>
@@ -1544,52 +1983,95 @@
     </w:p>
     <w:p>
       <w:pPr>
-        <w:spacing w:after="160" w:line="259" w:lineRule="auto"/>
-        <w:ind w:left="0" w:firstLine="0"/>
-        <w:jc w:val="left"/>
-        <w:rPr>
-          <w:color w:val="2F5496"/>
-          <w:sz w:val="32"/>
-        </w:rPr>
-      </w:pPr>
-      <w:r>
-        <w:rPr>
-          <w:color w:val="2F5496"/>
-          <w:sz w:val="32"/>
+        <w:pStyle w:val="Ttulo1"/>
+        <w:ind w:firstLine="695"/>
+        <w:rPr>
+          <w:rStyle w:val="Textoennegrita"/>
+        </w:rPr>
+      </w:pPr>
+      <w:bookmarkStart w:id="3" w:name="_Toc241249781"/>
+      <w:r>
+        <w:rPr>
+          <w:rStyle w:val="Textoennegrita"/>
         </w:rPr>
         <w:lastRenderedPageBreak/>
         <w:t>DESARROLLO</w:t>
       </w:r>
+      <w:bookmarkEnd w:id="3"/>
     </w:p>
     <w:p>
       <w:pPr>
+        <w:pStyle w:val="Ttulo1"/>
+        <w:ind w:firstLine="695"/>
+        <w:rPr>
+          <w:rStyle w:val="Textoennegrita"/>
+        </w:rPr>
+      </w:pPr>
+      <w:r>
+        <w:rPr>
+          <w:rStyle w:val="Textoennegrita"/>
+        </w:rPr>
+        <w:tab/>
+      </w:r>
+      <w:bookmarkStart w:id="4" w:name="_Toc241249782"/>
+      <w:r>
+        <w:rPr>
+          <w:rStyle w:val="Textoennegrita"/>
+        </w:rPr>
+        <w:t>Servicios</w:t>
+      </w:r>
+      <w:bookmarkEnd w:id="4"/>
+    </w:p>
+    <w:p>
+      <w:pPr>
         <w:ind w:left="0" w:firstLine="0"/>
       </w:pPr>
       <w:proofErr w:type="spellStart"/>
       <w:r>
+        <w:rPr>
+          <w:b/>
+        </w:rPr>
         <w:t>IaaS</w:t>
       </w:r>
       <w:proofErr w:type="spellEnd"/>
       <w:r>
+        <w:rPr>
+          <w:b/>
+        </w:rPr>
         <w:t xml:space="preserve"> (</w:t>
       </w:r>
       <w:proofErr w:type="spellStart"/>
       <w:r>
+        <w:rPr>
+          <w:b/>
+        </w:rPr>
         <w:t>Infraestructure</w:t>
       </w:r>
       <w:proofErr w:type="spellEnd"/>
       <w:r>
+        <w:rPr>
+          <w:b/>
+        </w:rPr>
         <w:t xml:space="preserve"> As A </w:t>
       </w:r>
       <w:proofErr w:type="spellStart"/>
       <w:r>
+        <w:rPr>
+          <w:b/>
+        </w:rPr>
         <w:t>Service</w:t>
       </w:r>
       <w:proofErr w:type="spellEnd"/>
       <w:r>
+        <w:rPr>
+          <w:b/>
+        </w:rPr>
         <w:t>)</w:t>
       </w:r>
       <w:r>
+        <w:rPr>
+          <w:b/>
+        </w:rPr>
         <w:sym w:font="Wingdings" w:char="F0E0"/>
       </w:r>
       <w:r>
@@ -1628,29 +2110,50 @@
     <w:p>
       <w:proofErr w:type="spellStart"/>
       <w:r>
+        <w:rPr>
+          <w:b/>
+        </w:rPr>
         <w:t>PaaS</w:t>
       </w:r>
       <w:proofErr w:type="spellEnd"/>
       <w:r>
+        <w:rPr>
+          <w:b/>
+        </w:rPr>
         <w:t xml:space="preserve"> (</w:t>
       </w:r>
       <w:proofErr w:type="spellStart"/>
       <w:r>
+        <w:rPr>
+          <w:b/>
+        </w:rPr>
         <w:t>Platform</w:t>
       </w:r>
       <w:proofErr w:type="spellEnd"/>
       <w:r>
+        <w:rPr>
+          <w:b/>
+        </w:rPr>
         <w:t xml:space="preserve"> As A </w:t>
       </w:r>
       <w:proofErr w:type="spellStart"/>
       <w:r>
+        <w:rPr>
+          <w:b/>
+        </w:rPr>
         <w:t>Service</w:t>
       </w:r>
       <w:proofErr w:type="spellEnd"/>
       <w:r>
+        <w:rPr>
+          <w:b/>
+        </w:rPr>
         <w:t>)</w:t>
       </w:r>
       <w:r>
+        <w:rPr>
+          <w:b/>
+        </w:rPr>
         <w:sym w:font="Wingdings" w:char="F0E0"/>
       </w:r>
       <w:r>
@@ -1721,17 +2224,29 @@
         <w:jc w:val="left"/>
       </w:pPr>
       <w:r>
+        <w:rPr>
+          <w:b/>
+        </w:rPr>
         <w:t>SaaS (</w:t>
       </w:r>
       <w:proofErr w:type="spellStart"/>
       <w:r>
+        <w:rPr>
+          <w:b/>
+        </w:rPr>
         <w:t>Service</w:t>
       </w:r>
       <w:proofErr w:type="spellEnd"/>
       <w:r>
+        <w:rPr>
+          <w:b/>
+        </w:rPr>
         <w:t xml:space="preserve"> As A Software)</w:t>
       </w:r>
       <w:r>
+        <w:rPr>
+          <w:b/>
+        </w:rPr>
         <w:sym w:font="Wingdings" w:char="F0E0"/>
       </w:r>
       <w:r>
@@ -1787,14 +2302,22 @@
     </w:p>
     <w:p>
       <w:pPr>
-        <w:ind w:left="0" w:firstLine="0"/>
-      </w:pPr>
-      <w:r>
+        <w:pStyle w:val="Ttulo1"/>
+        <w:ind w:firstLine="695"/>
+        <w:rPr>
+          <w:rStyle w:val="Textoennegrita"/>
+        </w:rPr>
+      </w:pPr>
+      <w:bookmarkStart w:id="5" w:name="_Toc241249614"/>
+      <w:bookmarkStart w:id="6" w:name="_Toc241249783"/>
+      <w:r>
+        <w:rPr>
+          <w:rStyle w:val="Textoennegrita"/>
+        </w:rPr>
         <w:t>Nubes</w:t>
       </w:r>
-      <w:r>
-        <w:sym w:font="Wingdings" w:char="F0E0"/>
-      </w:r>
+      <w:bookmarkEnd w:id="5"/>
+      <w:bookmarkEnd w:id="6"/>
     </w:p>
     <w:p>
       <w:pPr>
@@ -1922,10 +2445,23 @@
     <w:p/>
     <w:p/>
     <w:p>
-      <w:r>
-        <w:lastRenderedPageBreak/>
+      <w:pPr>
+        <w:pStyle w:val="Ttulo1"/>
+        <w:ind w:firstLine="695"/>
+        <w:rPr>
+          <w:rStyle w:val="Textoennegrita"/>
+        </w:rPr>
+      </w:pPr>
+      <w:bookmarkStart w:id="7" w:name="_Toc241249615"/>
+      <w:bookmarkStart w:id="8" w:name="_Toc241249784"/>
+      <w:r>
+        <w:rPr>
+          <w:rStyle w:val="Textoennegrita"/>
+        </w:rPr>
         <w:t>Idea de negocio</w:t>
       </w:r>
+      <w:bookmarkEnd w:id="7"/>
+      <w:bookmarkEnd w:id="8"/>
     </w:p>
     <w:p>
       <w:pPr>
@@ -1989,20 +2525,150 @@
       <w:pPr>
         <w:ind w:left="705" w:firstLine="0"/>
         <w:rPr>
-          <w:b/>
-        </w:rPr>
-      </w:pPr>
-      <w:r>
-        <w:rPr>
-          <w:b/>
-        </w:rPr>
-        <w:t xml:space="preserve">Sería un servicio ya listo para usar, el cual cuando se contrate se conecta a su web, e inventario de productos en stock, haciendo un recuento total en tiempo real; de manera que siempre esta actualizado, una vez detecte el programa un cambio en el inventario mandaría una señal tipo evento de cambio de registro </w:t>
-      </w:r>
-      <w:bookmarkStart w:id="0" w:name="_GoBack"/>
-      <w:bookmarkEnd w:id="0"/>
-      <w:r>
-        <w:rPr>
-          <w:b/>
+          <w:i/>
+        </w:rPr>
+      </w:pPr>
+      <w:r>
+        <w:rPr>
+          <w:i/>
+        </w:rPr>
+        <w:t xml:space="preserve">Sería un servicio ya listo para usar, el cual </w:t>
+      </w:r>
+      <w:r>
+        <w:rPr>
+          <w:i/>
+        </w:rPr>
+        <w:t>a la hora de contratarse,</w:t>
+      </w:r>
+      <w:r>
+        <w:rPr>
+          <w:i/>
+        </w:rPr>
+        <w:t xml:space="preserve"> se conecta a su web</w:t>
+      </w:r>
+      <w:r>
+        <w:rPr>
+          <w:i/>
+        </w:rPr>
+        <w:t xml:space="preserve"> (con las credenciales necesarias)</w:t>
+      </w:r>
+      <w:r>
+        <w:rPr>
+          <w:i/>
+        </w:rPr>
+        <w:t xml:space="preserve">, </w:t>
+      </w:r>
+      <w:r>
+        <w:rPr>
+          <w:i/>
+        </w:rPr>
+        <w:t>pidiendo únicamente acceso al inventariado</w:t>
+      </w:r>
+      <w:r>
+        <w:rPr>
+          <w:i/>
+        </w:rPr>
+        <w:t>, haciendo un recuento total</w:t>
+      </w:r>
+      <w:r>
+        <w:rPr>
+          <w:i/>
+        </w:rPr>
+        <w:t xml:space="preserve"> del stock</w:t>
+      </w:r>
+      <w:r>
+        <w:rPr>
+          <w:i/>
+        </w:rPr>
+        <w:t xml:space="preserve"> en tiempo real; de manera que siempre esta</w:t>
+      </w:r>
+      <w:r>
+        <w:rPr>
+          <w:i/>
+        </w:rPr>
+        <w:t>ría</w:t>
+      </w:r>
+      <w:r>
+        <w:rPr>
+          <w:i/>
+        </w:rPr>
+        <w:t xml:space="preserve"> actualizado</w:t>
+      </w:r>
+      <w:r>
+        <w:rPr>
+          <w:i/>
+        </w:rPr>
+        <w:t xml:space="preserve">; una vez </w:t>
+      </w:r>
+      <w:r>
+        <w:rPr>
+          <w:i/>
+        </w:rPr>
+        <w:t xml:space="preserve">el programa </w:t>
+      </w:r>
+      <w:r>
+        <w:rPr>
+          <w:i/>
+        </w:rPr>
+        <w:t xml:space="preserve">detecte </w:t>
+      </w:r>
+      <w:r>
+        <w:rPr>
+          <w:i/>
+        </w:rPr>
+        <w:t xml:space="preserve">un cambio en el </w:t>
+      </w:r>
+      <w:r>
+        <w:rPr>
+          <w:i/>
+        </w:rPr>
+        <w:t>stock</w:t>
+      </w:r>
+      <w:r>
+        <w:rPr>
+          <w:i/>
+        </w:rPr>
+        <w:t>,</w:t>
+      </w:r>
+      <w:r>
+        <w:rPr>
+          <w:i/>
+        </w:rPr>
+        <w:t xml:space="preserve"> </w:t>
+      </w:r>
+      <w:r>
+        <w:rPr>
+          <w:i/>
+        </w:rPr>
+        <w:t xml:space="preserve">se </w:t>
+      </w:r>
+      <w:r>
+        <w:rPr>
+          <w:i/>
+        </w:rPr>
+        <w:t>mandaría una señal tipo evento</w:t>
+      </w:r>
+      <w:r>
+        <w:rPr>
+          <w:i/>
+        </w:rPr>
+        <w:t>, para cambiar el</w:t>
+      </w:r>
+      <w:r>
+        <w:rPr>
+          <w:i/>
+        </w:rPr>
+        <w:t xml:space="preserve"> registro </w:t>
+      </w:r>
+      <w:r>
+        <w:rPr>
+          <w:i/>
+        </w:rPr>
+        <w:t>según se requiera.</w:t>
+      </w:r>
+      <w:r>
+        <w:rPr>
+          <w:i/>
         </w:rPr>
         <w:br w:type="page"/>
       </w:r>
@@ -3072,6 +3738,73 @@
       <w:color w:val="3B3838"/>
     </w:rPr>
   </w:style>
+  <w:style w:type="paragraph" w:styleId="Ttulo1">
+    <w:name w:val="heading 1"/>
+    <w:basedOn w:val="Normal"/>
+    <w:next w:val="Normal"/>
+    <w:link w:val="Ttulo1Car"/>
+    <w:uiPriority w:val="9"/>
+    <w:qFormat/>
+    <w:rsid w:val="00BB4A01"/>
+    <w:pPr>
+      <w:keepNext/>
+      <w:keepLines/>
+      <w:spacing w:before="240"/>
+      <w:outlineLvl w:val="0"/>
+    </w:pPr>
+    <w:rPr>
+      <w:rFonts w:asciiTheme="majorHAnsi" w:eastAsiaTheme="majorEastAsia" w:hAnsiTheme="majorHAnsi" w:cstheme="majorBidi"/>
+      <w:color w:val="2E74B5" w:themeColor="accent1" w:themeShade="BF"/>
+      <w:sz w:val="32"/>
+      <w:szCs w:val="32"/>
+    </w:rPr>
+  </w:style>
+  <w:style w:type="paragraph" w:styleId="Ttulo2">
+    <w:name w:val="heading 2"/>
+    <w:basedOn w:val="Normal"/>
+    <w:next w:val="Normal"/>
+    <w:link w:val="Ttulo2Car"/>
+    <w:uiPriority w:val="9"/>
+    <w:semiHidden/>
+    <w:unhideWhenUsed/>
+    <w:qFormat/>
+    <w:rsid w:val="00BB4A01"/>
+    <w:pPr>
+      <w:keepNext/>
+      <w:keepLines/>
+      <w:spacing w:before="40"/>
+      <w:outlineLvl w:val="1"/>
+    </w:pPr>
+    <w:rPr>
+      <w:rFonts w:asciiTheme="majorHAnsi" w:eastAsiaTheme="majorEastAsia" w:hAnsiTheme="majorHAnsi" w:cstheme="majorBidi"/>
+      <w:color w:val="2E74B5" w:themeColor="accent1" w:themeShade="BF"/>
+      <w:sz w:val="26"/>
+      <w:szCs w:val="26"/>
+    </w:rPr>
+  </w:style>
+  <w:style w:type="paragraph" w:styleId="Ttulo3">
+    <w:name w:val="heading 3"/>
+    <w:basedOn w:val="Normal"/>
+    <w:next w:val="Normal"/>
+    <w:link w:val="Ttulo3Car"/>
+    <w:uiPriority w:val="9"/>
+    <w:semiHidden/>
+    <w:unhideWhenUsed/>
+    <w:qFormat/>
+    <w:rsid w:val="00BB4A01"/>
+    <w:pPr>
+      <w:keepNext/>
+      <w:keepLines/>
+      <w:spacing w:before="40"/>
+      <w:outlineLvl w:val="2"/>
+    </w:pPr>
+    <w:rPr>
+      <w:rFonts w:asciiTheme="majorHAnsi" w:eastAsiaTheme="majorEastAsia" w:hAnsiTheme="majorHAnsi" w:cstheme="majorBidi"/>
+      <w:color w:val="1F4D78" w:themeColor="accent1" w:themeShade="7F"/>
+      <w:sz w:val="24"/>
+      <w:szCs w:val="24"/>
+    </w:rPr>
+  </w:style>
   <w:style w:type="character" w:default="1" w:styleId="Fuentedeprrafopredeter">
     <w:name w:val="Default Paragraph Font"/>
     <w:uiPriority w:val="1"/>
@@ -3127,6 +3860,103 @@
       <w:contextualSpacing/>
     </w:pPr>
   </w:style>
+  <w:style w:type="character" w:customStyle="1" w:styleId="Ttulo1Car">
+    <w:name w:val="Título 1 Car"/>
+    <w:basedOn w:val="Fuentedeprrafopredeter"/>
+    <w:link w:val="Ttulo1"/>
+    <w:uiPriority w:val="9"/>
+    <w:rsid w:val="00BB4A01"/>
+    <w:rPr>
+      <w:rFonts w:asciiTheme="majorHAnsi" w:eastAsiaTheme="majorEastAsia" w:hAnsiTheme="majorHAnsi" w:cstheme="majorBidi"/>
+      <w:color w:val="2E74B5" w:themeColor="accent1" w:themeShade="BF"/>
+      <w:sz w:val="32"/>
+      <w:szCs w:val="32"/>
+    </w:rPr>
+  </w:style>
+  <w:style w:type="character" w:styleId="Textoennegrita">
+    <w:name w:val="Strong"/>
+    <w:basedOn w:val="Fuentedeprrafopredeter"/>
+    <w:uiPriority w:val="22"/>
+    <w:qFormat/>
+    <w:rsid w:val="00BB4A01"/>
+    <w:rPr>
+      <w:b/>
+      <w:bCs/>
+    </w:rPr>
+  </w:style>
+  <w:style w:type="paragraph" w:styleId="Cita">
+    <w:name w:val="Quote"/>
+    <w:basedOn w:val="Normal"/>
+    <w:next w:val="Normal"/>
+    <w:link w:val="CitaCar"/>
+    <w:uiPriority w:val="29"/>
+    <w:qFormat/>
+    <w:rsid w:val="00BB4A01"/>
+    <w:pPr>
+      <w:spacing w:before="200" w:after="160"/>
+      <w:ind w:left="864" w:right="864"/>
+      <w:jc w:val="center"/>
+    </w:pPr>
+    <w:rPr>
+      <w:i/>
+      <w:iCs/>
+      <w:color w:val="404040" w:themeColor="text1" w:themeTint="BF"/>
+    </w:rPr>
+  </w:style>
+  <w:style w:type="character" w:customStyle="1" w:styleId="CitaCar">
+    <w:name w:val="Cita Car"/>
+    <w:basedOn w:val="Fuentedeprrafopredeter"/>
+    <w:link w:val="Cita"/>
+    <w:uiPriority w:val="29"/>
+    <w:rsid w:val="00BB4A01"/>
+    <w:rPr>
+      <w:rFonts w:ascii="Calibri" w:eastAsia="Calibri" w:hAnsi="Calibri" w:cs="Calibri"/>
+      <w:i/>
+      <w:iCs/>
+      <w:color w:val="404040" w:themeColor="text1" w:themeTint="BF"/>
+    </w:rPr>
+  </w:style>
+  <w:style w:type="character" w:customStyle="1" w:styleId="Ttulo2Car">
+    <w:name w:val="Título 2 Car"/>
+    <w:basedOn w:val="Fuentedeprrafopredeter"/>
+    <w:link w:val="Ttulo2"/>
+    <w:uiPriority w:val="9"/>
+    <w:semiHidden/>
+    <w:rsid w:val="00BB4A01"/>
+    <w:rPr>
+      <w:rFonts w:asciiTheme="majorHAnsi" w:eastAsiaTheme="majorEastAsia" w:hAnsiTheme="majorHAnsi" w:cstheme="majorBidi"/>
+      <w:color w:val="2E74B5" w:themeColor="accent1" w:themeShade="BF"/>
+      <w:sz w:val="26"/>
+      <w:szCs w:val="26"/>
+    </w:rPr>
+  </w:style>
+  <w:style w:type="character" w:customStyle="1" w:styleId="Ttulo3Car">
+    <w:name w:val="Título 3 Car"/>
+    <w:basedOn w:val="Fuentedeprrafopredeter"/>
+    <w:link w:val="Ttulo3"/>
+    <w:uiPriority w:val="9"/>
+    <w:semiHidden/>
+    <w:rsid w:val="00BB4A01"/>
+    <w:rPr>
+      <w:rFonts w:asciiTheme="majorHAnsi" w:eastAsiaTheme="majorEastAsia" w:hAnsiTheme="majorHAnsi" w:cstheme="majorBidi"/>
+      <w:color w:val="1F4D78" w:themeColor="accent1" w:themeShade="7F"/>
+      <w:sz w:val="24"/>
+      <w:szCs w:val="24"/>
+    </w:rPr>
+  </w:style>
+  <w:style w:type="paragraph" w:styleId="TDC1">
+    <w:name w:val="toc 1"/>
+    <w:basedOn w:val="Normal"/>
+    <w:next w:val="Normal"/>
+    <w:autoRedefine/>
+    <w:uiPriority w:val="39"/>
+    <w:unhideWhenUsed/>
+    <w:rsid w:val="00BB4A01"/>
+    <w:pPr>
+      <w:spacing w:after="100"/>
+      <w:ind w:left="0"/>
+    </w:pPr>
+  </w:style>
 </w:styles>
 </file>
 
@@ -3184,7 +4014,7 @@
     <w:charset w:val="00"/>
     <w:family w:val="roman"/>
     <w:pitch w:val="variable"/>
-    <w:sig w:usb0="E0002AFF" w:usb1="C0007843" w:usb2="00000009" w:usb3="00000000" w:csb0="000001FF" w:csb1="00000000"/>
+    <w:sig w:usb0="E0002EFF" w:usb1="C000785B" w:usb2="00000009" w:usb3="00000000" w:csb0="000001FF" w:csb1="00000000"/>
   </w:font>
   <w:font w:name="Courier New">
     <w:panose1 w:val="02070309020205020404"/>
@@ -3205,7 +4035,7 @@
     <w:charset w:val="00"/>
     <w:family w:val="swiss"/>
     <w:pitch w:val="variable"/>
-    <w:sig w:usb0="E0002AFF" w:usb1="C0007843" w:usb2="00000009" w:usb3="00000000" w:csb0="000001FF" w:csb1="00000000"/>
+    <w:sig w:usb0="E0002EFF" w:usb1="C000785B" w:usb2="00000009" w:usb3="00000000" w:csb0="000001FF" w:csb1="00000000"/>
   </w:font>
   <w:font w:name="Segoe UI Symbol">
     <w:panose1 w:val="020B0502040204020203"/>
@@ -3219,14 +4049,14 @@
     <w:charset w:val="00"/>
     <w:family w:val="swiss"/>
     <w:pitch w:val="variable"/>
-    <w:sig w:usb0="E00002FF" w:usb1="4000ACFF" w:usb2="00000001" w:usb3="00000000" w:csb0="0000019F" w:csb1="00000000"/>
+    <w:sig w:usb0="E4002EFF" w:usb1="C200247B" w:usb2="00000009" w:usb3="00000000" w:csb0="000001FF" w:csb1="00000000"/>
   </w:font>
   <w:font w:name="Calibri Light">
     <w:panose1 w:val="020F0302020204030204"/>
     <w:charset w:val="00"/>
     <w:family w:val="swiss"/>
     <w:pitch w:val="variable"/>
-    <w:sig w:usb0="A00002EF" w:usb1="4000207B" w:usb2="00000000" w:usb3="00000000" w:csb0="0000009F" w:csb1="00000000"/>
+    <w:sig w:usb0="E4002EFF" w:usb1="C200247B" w:usb2="00000009" w:usb3="00000000" w:csb0="000001FF" w:csb1="00000000"/>
   </w:font>
 </w:fonts>
 </file>
@@ -3247,7 +4077,9 @@
   </w:compat>
   <w:rsids>
     <w:rsidRoot w:val="00EB7B7F"/>
+    <w:rsid w:val="001C103A"/>
     <w:rsid w:val="002077B2"/>
+    <w:rsid w:val="009957AF"/>
     <w:rsid w:val="00EB7B7F"/>
   </w:rsids>
   <m:mathPr>
@@ -3973,7 +4805,7 @@
 
 <file path=customXml/item1.xml><?xml version="1.0" encoding="utf-8"?>
 <CoverPageProperties xmlns="http://schemas.microsoft.com/office/2006/coverPageProps">
-  <PublishDate>2026-09-18T00:00:00</PublishDate>
+  <PublishDate>2026-09-25T00:00:00</PublishDate>
   <Abstract/>
   <CompanyAddress/>
   <CompanyPhone/>
@@ -3995,7 +4827,7 @@
 </file>
 
 <file path=customXml/itemProps2.xml><?xml version="1.0" encoding="utf-8"?>
-<ds:datastoreItem xmlns:ds="http://schemas.openxmlformats.org/officeDocument/2006/customXml" ds:itemID="{BCD2555B-18A3-4A30-80C4-C779DFF1F84B}">
+<ds:datastoreItem xmlns:ds="http://schemas.openxmlformats.org/officeDocument/2006/customXml" ds:itemID="{3897F8F0-F002-426E-ABA8-4007B92DD94B}">
   <ds:schemaRefs>
     <ds:schemaRef ds:uri="http://schemas.openxmlformats.org/officeDocument/2006/bibliography"/>
   </ds:schemaRefs>

</xml_diff>